<commit_message>
Se sigue con el avance del informe del desafio
</commit_message>
<xml_diff>
--- a/INFORME DESAFIO II.docx
+++ b/INFORME DESAFIO II.docx
@@ -75,6 +75,12 @@
         <w:rPr>
           <w:lang w:val="es-ES"/>
         </w:rPr>
+        <w:t xml:space="preserve">A </w:t>
+      </w:r>
+      <w:r>
+        <w:rPr>
+          <w:lang w:val="es-ES"/>
+        </w:rPr>
         <w:t>ANALISIS DEL PROBLEMA Y CONSIDERACIONES PARA LA ALTERNATIVA DE LA SOLUCION PROPUESTA:</w:t>
       </w:r>
       <w:r>
@@ -145,6 +151,15 @@
           <w:lang w:val="es-ES"/>
         </w:rPr>
       </w:pPr>
+      <w:r>
+        <w:rPr>
+          <w:rFonts w:ascii="Times New Roman" w:hAnsi="Times New Roman" w:cs="Times New Roman"/>
+          <w:sz w:val="24"/>
+          <w:szCs w:val="24"/>
+          <w:lang w:val="es-ES"/>
+        </w:rPr>
+        <w:t xml:space="preserve">B </w:t>
+      </w:r>
       <w:r>
         <w:rPr>
           <w:rFonts w:ascii="Times New Roman" w:hAnsi="Times New Roman" w:cs="Times New Roman"/>
@@ -301,6 +316,685 @@
         </w:rPr>
         <w:br/>
       </w:r>
+      <w:r>
+        <w:rPr>
+          <w:rFonts w:ascii="Times New Roman" w:hAnsi="Times New Roman" w:cs="Times New Roman"/>
+          <w:sz w:val="24"/>
+          <w:szCs w:val="24"/>
+          <w:lang w:val="es-ES"/>
+        </w:rPr>
+        <w:t>SIMULACION DE LOS PARTIDOS:</w:t>
+      </w:r>
+      <w:r>
+        <w:rPr>
+          <w:rFonts w:ascii="Times New Roman" w:hAnsi="Times New Roman" w:cs="Times New Roman"/>
+          <w:sz w:val="24"/>
+          <w:szCs w:val="24"/>
+          <w:lang w:val="es-ES"/>
+        </w:rPr>
+        <w:br/>
+      </w:r>
+      <w:r>
+        <w:rPr>
+          <w:rFonts w:ascii="Times New Roman" w:hAnsi="Times New Roman" w:cs="Times New Roman"/>
+          <w:sz w:val="24"/>
+          <w:szCs w:val="24"/>
+          <w:lang w:val="es-ES"/>
+        </w:rPr>
+        <w:br/>
+        <w:t xml:space="preserve">La simulación de los partidos se realiza generando valores aleatorios para los goles de cada equipo que este en el partido. Posteriormente: </w:t>
+      </w:r>
+      <w:r>
+        <w:rPr>
+          <w:rFonts w:ascii="Times New Roman" w:hAnsi="Times New Roman" w:cs="Times New Roman"/>
+          <w:sz w:val="24"/>
+          <w:szCs w:val="24"/>
+          <w:lang w:val="es-ES"/>
+        </w:rPr>
+        <w:br/>
+      </w:r>
+      <w:r>
+        <w:rPr>
+          <w:rFonts w:ascii="Times New Roman" w:hAnsi="Times New Roman" w:cs="Times New Roman"/>
+          <w:sz w:val="24"/>
+          <w:szCs w:val="24"/>
+          <w:lang w:val="es-ES"/>
+        </w:rPr>
+        <w:br/>
+        <w:t>1. Se actualizan los goles a favor y en contra de cada equipo</w:t>
+      </w:r>
+    </w:p>
+    <w:p>
+      <w:pPr>
+        <w:rPr>
+          <w:rFonts w:ascii="Times New Roman" w:hAnsi="Times New Roman" w:cs="Times New Roman"/>
+          <w:sz w:val="24"/>
+          <w:szCs w:val="24"/>
+          <w:lang w:val="es-ES"/>
+        </w:rPr>
+      </w:pPr>
+      <w:r>
+        <w:rPr>
+          <w:rFonts w:ascii="Times New Roman" w:hAnsi="Times New Roman" w:cs="Times New Roman"/>
+          <w:sz w:val="24"/>
+          <w:szCs w:val="24"/>
+          <w:lang w:val="es-ES"/>
+        </w:rPr>
+        <w:t>2. Se asignan los puntos según el resultado:</w:t>
+      </w:r>
+      <w:r>
+        <w:rPr>
+          <w:rFonts w:ascii="Times New Roman" w:hAnsi="Times New Roman" w:cs="Times New Roman"/>
+          <w:sz w:val="24"/>
+          <w:szCs w:val="24"/>
+          <w:lang w:val="es-ES"/>
+        </w:rPr>
+        <w:br/>
+      </w:r>
+      <w:r>
+        <w:rPr>
+          <w:rFonts w:ascii="Times New Roman" w:hAnsi="Times New Roman" w:cs="Times New Roman"/>
+          <w:sz w:val="24"/>
+          <w:szCs w:val="24"/>
+          <w:lang w:val="es-ES"/>
+        </w:rPr>
+        <w:br/>
+        <w:t>Victoria: 3 puntos</w:t>
+      </w:r>
+    </w:p>
+    <w:p>
+      <w:pPr>
+        <w:rPr>
+          <w:rFonts w:ascii="Times New Roman" w:hAnsi="Times New Roman" w:cs="Times New Roman"/>
+          <w:sz w:val="24"/>
+          <w:szCs w:val="24"/>
+          <w:lang w:val="es-ES"/>
+        </w:rPr>
+      </w:pPr>
+      <w:r>
+        <w:rPr>
+          <w:rFonts w:ascii="Times New Roman" w:hAnsi="Times New Roman" w:cs="Times New Roman"/>
+          <w:sz w:val="24"/>
+          <w:szCs w:val="24"/>
+          <w:lang w:val="es-ES"/>
+        </w:rPr>
+        <w:t>Empate: 1 punto</w:t>
+      </w:r>
+    </w:p>
+    <w:p>
+      <w:pPr>
+        <w:rPr>
+          <w:rFonts w:ascii="Times New Roman" w:hAnsi="Times New Roman" w:cs="Times New Roman"/>
+          <w:sz w:val="24"/>
+          <w:szCs w:val="24"/>
+          <w:lang w:val="es-ES"/>
+        </w:rPr>
+      </w:pPr>
+      <w:r>
+        <w:rPr>
+          <w:rFonts w:ascii="Times New Roman" w:hAnsi="Times New Roman" w:cs="Times New Roman"/>
+          <w:sz w:val="24"/>
+          <w:szCs w:val="24"/>
+          <w:lang w:val="es-ES"/>
+        </w:rPr>
+        <w:t xml:space="preserve">Derrota: 0 puntos </w:t>
+      </w:r>
+    </w:p>
+    <w:p>
+      <w:pPr>
+        <w:rPr>
+          <w:rFonts w:ascii="Times New Roman" w:hAnsi="Times New Roman" w:cs="Times New Roman"/>
+          <w:sz w:val="24"/>
+          <w:szCs w:val="24"/>
+          <w:lang w:val="es-ES"/>
+        </w:rPr>
+      </w:pPr>
+    </w:p>
+    <w:p>
+      <w:pPr>
+        <w:rPr>
+          <w:rFonts w:ascii="Times New Roman" w:hAnsi="Times New Roman" w:cs="Times New Roman"/>
+          <w:sz w:val="24"/>
+          <w:szCs w:val="24"/>
+          <w:lang w:val="es-ES"/>
+        </w:rPr>
+      </w:pPr>
+      <w:r>
+        <w:rPr>
+          <w:rFonts w:ascii="Times New Roman" w:hAnsi="Times New Roman" w:cs="Times New Roman"/>
+          <w:sz w:val="24"/>
+          <w:szCs w:val="24"/>
+          <w:lang w:val="es-ES"/>
+        </w:rPr>
+        <w:t>GENERACION DE PARTIDOS EN GRUPOS:</w:t>
+      </w:r>
+      <w:r>
+        <w:rPr>
+          <w:rFonts w:ascii="Times New Roman" w:hAnsi="Times New Roman" w:cs="Times New Roman"/>
+          <w:sz w:val="24"/>
+          <w:szCs w:val="24"/>
+          <w:lang w:val="es-ES"/>
+        </w:rPr>
+        <w:br/>
+      </w:r>
+      <w:r>
+        <w:rPr>
+          <w:rFonts w:ascii="Times New Roman" w:hAnsi="Times New Roman" w:cs="Times New Roman"/>
+          <w:sz w:val="24"/>
+          <w:szCs w:val="24"/>
+          <w:lang w:val="es-ES"/>
+        </w:rPr>
+        <w:br/>
+      </w:r>
+      <w:r>
+        <w:rPr>
+          <w:rFonts w:ascii="Times New Roman" w:hAnsi="Times New Roman" w:cs="Times New Roman"/>
+          <w:sz w:val="24"/>
+          <w:szCs w:val="24"/>
+          <w:lang w:val="es-ES"/>
+        </w:rPr>
+        <w:t>Para cada grupo, se generan partidos bajo el esquema “todos contra todos”. Esto se implementa mediante dos ciclos anidados que recorren los equipos sin repetir las combinaciones.</w:t>
+      </w:r>
+      <w:r>
+        <w:rPr>
+          <w:rFonts w:ascii="Times New Roman" w:hAnsi="Times New Roman" w:cs="Times New Roman"/>
+          <w:sz w:val="24"/>
+          <w:szCs w:val="24"/>
+          <w:lang w:val="es-ES"/>
+        </w:rPr>
+        <w:br/>
+      </w:r>
+      <w:r>
+        <w:rPr>
+          <w:rFonts w:ascii="Times New Roman" w:hAnsi="Times New Roman" w:cs="Times New Roman"/>
+          <w:sz w:val="24"/>
+          <w:szCs w:val="24"/>
+          <w:lang w:val="es-ES"/>
+        </w:rPr>
+        <w:br/>
+        <w:t>Serian seis partidos en total por cada grupo, asi, cada uno de los equipos juega contra los demás en un partido.</w:t>
+      </w:r>
+    </w:p>
+    <w:p>
+      <w:pPr>
+        <w:rPr>
+          <w:rFonts w:ascii="Times New Roman" w:hAnsi="Times New Roman" w:cs="Times New Roman"/>
+          <w:sz w:val="24"/>
+          <w:szCs w:val="24"/>
+          <w:lang w:val="es-ES"/>
+        </w:rPr>
+      </w:pPr>
+    </w:p>
+    <w:p>
+      <w:pPr>
+        <w:rPr>
+          <w:rFonts w:ascii="Times New Roman" w:hAnsi="Times New Roman" w:cs="Times New Roman"/>
+          <w:sz w:val="24"/>
+          <w:szCs w:val="24"/>
+          <w:lang w:val="es-ES"/>
+        </w:rPr>
+      </w:pPr>
+      <w:r>
+        <w:rPr>
+          <w:rFonts w:ascii="Times New Roman" w:hAnsi="Times New Roman" w:cs="Times New Roman"/>
+          <w:sz w:val="24"/>
+          <w:szCs w:val="24"/>
+          <w:lang w:val="es-ES"/>
+        </w:rPr>
+        <w:t>CONSTRUCCION DE LA TABLA DE POSICIONES:</w:t>
+      </w:r>
+      <w:r>
+        <w:rPr>
+          <w:rFonts w:ascii="Times New Roman" w:hAnsi="Times New Roman" w:cs="Times New Roman"/>
+          <w:sz w:val="24"/>
+          <w:szCs w:val="24"/>
+          <w:lang w:val="es-ES"/>
+        </w:rPr>
+        <w:br/>
+      </w:r>
+    </w:p>
+    <w:p>
+      <w:pPr>
+        <w:rPr>
+          <w:rFonts w:ascii="Times New Roman" w:hAnsi="Times New Roman" w:cs="Times New Roman"/>
+          <w:sz w:val="24"/>
+          <w:szCs w:val="24"/>
+          <w:lang w:val="es-ES"/>
+        </w:rPr>
+      </w:pPr>
+      <w:r>
+        <w:rPr>
+          <w:rFonts w:ascii="Times New Roman" w:hAnsi="Times New Roman" w:cs="Times New Roman"/>
+          <w:sz w:val="24"/>
+          <w:szCs w:val="24"/>
+          <w:lang w:val="es-ES"/>
+        </w:rPr>
+        <w:t>Después de simular los partidos, cada equipo cuenta con lo siguiente:</w:t>
+      </w:r>
+      <w:r>
+        <w:rPr>
+          <w:rFonts w:ascii="Times New Roman" w:hAnsi="Times New Roman" w:cs="Times New Roman"/>
+          <w:sz w:val="24"/>
+          <w:szCs w:val="24"/>
+          <w:lang w:val="es-ES"/>
+        </w:rPr>
+        <w:br/>
+      </w:r>
+      <w:r>
+        <w:rPr>
+          <w:rFonts w:ascii="Times New Roman" w:hAnsi="Times New Roman" w:cs="Times New Roman"/>
+          <w:sz w:val="24"/>
+          <w:szCs w:val="24"/>
+          <w:lang w:val="es-ES"/>
+        </w:rPr>
+        <w:br/>
+        <w:t>Puntos</w:t>
+      </w:r>
+      <w:r>
+        <w:rPr>
+          <w:rFonts w:ascii="Times New Roman" w:hAnsi="Times New Roman" w:cs="Times New Roman"/>
+          <w:sz w:val="24"/>
+          <w:szCs w:val="24"/>
+          <w:lang w:val="es-ES"/>
+        </w:rPr>
+        <w:br/>
+        <w:t>Goles a favor</w:t>
+      </w:r>
+      <w:r>
+        <w:rPr>
+          <w:rFonts w:ascii="Times New Roman" w:hAnsi="Times New Roman" w:cs="Times New Roman"/>
+          <w:sz w:val="24"/>
+          <w:szCs w:val="24"/>
+          <w:lang w:val="es-ES"/>
+        </w:rPr>
+        <w:br/>
+        <w:t xml:space="preserve">Goles en contra </w:t>
+      </w:r>
+      <w:r>
+        <w:rPr>
+          <w:rFonts w:ascii="Times New Roman" w:hAnsi="Times New Roman" w:cs="Times New Roman"/>
+          <w:sz w:val="24"/>
+          <w:szCs w:val="24"/>
+          <w:lang w:val="es-ES"/>
+        </w:rPr>
+        <w:br/>
+      </w:r>
+      <w:r>
+        <w:rPr>
+          <w:rFonts w:ascii="Times New Roman" w:hAnsi="Times New Roman" w:cs="Times New Roman"/>
+          <w:sz w:val="24"/>
+          <w:szCs w:val="24"/>
+          <w:lang w:val="es-ES"/>
+        </w:rPr>
+        <w:br/>
+        <w:t xml:space="preserve">A partir de estos datos se calcula la diferencia de los goles </w:t>
+      </w:r>
+    </w:p>
+    <w:p>
+      <w:pPr>
+        <w:rPr>
+          <w:rFonts w:ascii="Times New Roman" w:hAnsi="Times New Roman" w:cs="Times New Roman"/>
+          <w:sz w:val="24"/>
+          <w:szCs w:val="24"/>
+          <w:lang w:val="es-ES"/>
+        </w:rPr>
+      </w:pPr>
+    </w:p>
+    <w:p>
+      <w:pPr>
+        <w:rPr>
+          <w:rFonts w:ascii="Times New Roman" w:hAnsi="Times New Roman" w:cs="Times New Roman"/>
+          <w:sz w:val="24"/>
+          <w:szCs w:val="24"/>
+          <w:lang w:val="es-ES"/>
+        </w:rPr>
+      </w:pPr>
+    </w:p>
+    <w:p>
+      <w:pPr>
+        <w:rPr>
+          <w:rFonts w:ascii="Times New Roman" w:hAnsi="Times New Roman" w:cs="Times New Roman"/>
+          <w:sz w:val="24"/>
+          <w:szCs w:val="24"/>
+          <w:lang w:val="es-ES"/>
+        </w:rPr>
+      </w:pPr>
+      <w:r>
+        <w:rPr>
+          <w:rFonts w:ascii="Times New Roman" w:hAnsi="Times New Roman" w:cs="Times New Roman"/>
+          <w:sz w:val="24"/>
+          <w:szCs w:val="24"/>
+          <w:lang w:val="es-ES"/>
+        </w:rPr>
+        <w:lastRenderedPageBreak/>
+        <w:t>ORDENAMIENTO DE LA TABLA:</w:t>
+      </w:r>
+      <w:r>
+        <w:rPr>
+          <w:rFonts w:ascii="Times New Roman" w:hAnsi="Times New Roman" w:cs="Times New Roman"/>
+          <w:sz w:val="24"/>
+          <w:szCs w:val="24"/>
+          <w:lang w:val="es-ES"/>
+        </w:rPr>
+        <w:br/>
+      </w:r>
+      <w:r>
+        <w:rPr>
+          <w:rFonts w:ascii="Times New Roman" w:hAnsi="Times New Roman" w:cs="Times New Roman"/>
+          <w:sz w:val="24"/>
+          <w:szCs w:val="24"/>
+          <w:lang w:val="es-ES"/>
+        </w:rPr>
+        <w:br/>
+        <w:t>Se implementa un algoritmo de ordenamiento (burbuja) que organiza los equipos según:</w:t>
+      </w:r>
+      <w:r>
+        <w:rPr>
+          <w:rFonts w:ascii="Times New Roman" w:hAnsi="Times New Roman" w:cs="Times New Roman"/>
+          <w:sz w:val="24"/>
+          <w:szCs w:val="24"/>
+          <w:lang w:val="es-ES"/>
+        </w:rPr>
+        <w:br/>
+      </w:r>
+      <w:r>
+        <w:rPr>
+          <w:rFonts w:ascii="Times New Roman" w:hAnsi="Times New Roman" w:cs="Times New Roman"/>
+          <w:sz w:val="24"/>
+          <w:szCs w:val="24"/>
+          <w:lang w:val="es-ES"/>
+        </w:rPr>
+        <w:br/>
+        <w:t>1 Puntos (descendente)</w:t>
+      </w:r>
+      <w:r>
+        <w:rPr>
+          <w:rFonts w:ascii="Times New Roman" w:hAnsi="Times New Roman" w:cs="Times New Roman"/>
+          <w:sz w:val="24"/>
+          <w:szCs w:val="24"/>
+          <w:lang w:val="es-ES"/>
+        </w:rPr>
+        <w:br/>
+        <w:t xml:space="preserve">2 Diferencia de goles </w:t>
+      </w:r>
+      <w:r>
+        <w:rPr>
+          <w:rFonts w:ascii="Times New Roman" w:hAnsi="Times New Roman" w:cs="Times New Roman"/>
+          <w:sz w:val="24"/>
+          <w:szCs w:val="24"/>
+          <w:lang w:val="es-ES"/>
+        </w:rPr>
+        <w:br/>
+        <w:t>3 Goles a favor</w:t>
+      </w:r>
+      <w:r>
+        <w:rPr>
+          <w:rFonts w:ascii="Times New Roman" w:hAnsi="Times New Roman" w:cs="Times New Roman"/>
+          <w:sz w:val="24"/>
+          <w:szCs w:val="24"/>
+          <w:lang w:val="es-ES"/>
+        </w:rPr>
+        <w:br/>
+      </w:r>
+      <w:r>
+        <w:rPr>
+          <w:rFonts w:ascii="Times New Roman" w:hAnsi="Times New Roman" w:cs="Times New Roman"/>
+          <w:sz w:val="24"/>
+          <w:szCs w:val="24"/>
+          <w:lang w:val="es-ES"/>
+        </w:rPr>
+        <w:br/>
+        <w:t>Se intercambian punteros a equipos para evitar copias de los objetos completos</w:t>
+      </w:r>
+    </w:p>
+    <w:p>
+      <w:pPr>
+        <w:rPr>
+          <w:rFonts w:ascii="Times New Roman" w:hAnsi="Times New Roman" w:cs="Times New Roman"/>
+          <w:sz w:val="24"/>
+          <w:szCs w:val="24"/>
+          <w:lang w:val="es-ES"/>
+        </w:rPr>
+      </w:pPr>
+    </w:p>
+    <w:p>
+      <w:pPr>
+        <w:rPr>
+          <w:rFonts w:ascii="Times New Roman" w:hAnsi="Times New Roman" w:cs="Times New Roman"/>
+          <w:sz w:val="24"/>
+          <w:szCs w:val="24"/>
+          <w:lang w:val="es-ES"/>
+        </w:rPr>
+      </w:pPr>
+      <w:r>
+        <w:rPr>
+          <w:rFonts w:ascii="Times New Roman" w:hAnsi="Times New Roman" w:cs="Times New Roman"/>
+          <w:sz w:val="24"/>
+          <w:szCs w:val="24"/>
+          <w:lang w:val="es-ES"/>
+        </w:rPr>
+        <w:t>D PROBLEMAS DE DESARROLLO QUE AFRONTO:</w:t>
+      </w:r>
+      <w:r>
+        <w:rPr>
+          <w:rFonts w:ascii="Times New Roman" w:hAnsi="Times New Roman" w:cs="Times New Roman"/>
+          <w:sz w:val="24"/>
+          <w:szCs w:val="24"/>
+          <w:lang w:val="es-ES"/>
+        </w:rPr>
+        <w:br/>
+      </w:r>
+      <w:r>
+        <w:rPr>
+          <w:rFonts w:ascii="Times New Roman" w:hAnsi="Times New Roman" w:cs="Times New Roman"/>
+          <w:sz w:val="24"/>
+          <w:szCs w:val="24"/>
+          <w:lang w:val="es-ES"/>
+        </w:rPr>
+        <w:br/>
+        <w:t>Durante la implementación del desafío se evidenciaron varios problemas relevantes a tener en cuenta:</w:t>
+      </w:r>
+    </w:p>
+    <w:p>
+      <w:pPr>
+        <w:rPr>
+          <w:rFonts w:ascii="Times New Roman" w:hAnsi="Times New Roman" w:cs="Times New Roman"/>
+          <w:sz w:val="24"/>
+          <w:szCs w:val="24"/>
+          <w:lang w:val="es-ES"/>
+        </w:rPr>
+      </w:pPr>
+      <w:r>
+        <w:rPr>
+          <w:rFonts w:ascii="Times New Roman" w:hAnsi="Times New Roman" w:cs="Times New Roman"/>
+          <w:sz w:val="24"/>
+          <w:szCs w:val="24"/>
+          <w:lang w:val="es-ES"/>
+        </w:rPr>
+        <w:t>ERRORES DE CONSTRUCTORES POR DEFECTO:</w:t>
+      </w:r>
+      <w:r>
+        <w:rPr>
+          <w:rFonts w:ascii="Times New Roman" w:hAnsi="Times New Roman" w:cs="Times New Roman"/>
+          <w:sz w:val="24"/>
+          <w:szCs w:val="24"/>
+          <w:lang w:val="es-ES"/>
+        </w:rPr>
+        <w:br/>
+        <w:t xml:space="preserve">Al usar arreglos dinámicos de objetos, fue necesario implementar constructores vacíos para permitir la creación inicial de los objetos </w:t>
+      </w:r>
+      <w:r>
+        <w:rPr>
+          <w:rFonts w:ascii="Times New Roman" w:hAnsi="Times New Roman" w:cs="Times New Roman"/>
+          <w:sz w:val="24"/>
+          <w:szCs w:val="24"/>
+          <w:lang w:val="es-ES"/>
+        </w:rPr>
+        <w:br/>
+      </w:r>
+      <w:r>
+        <w:rPr>
+          <w:rFonts w:ascii="Times New Roman" w:hAnsi="Times New Roman" w:cs="Times New Roman"/>
+          <w:sz w:val="24"/>
+          <w:szCs w:val="24"/>
+          <w:lang w:val="es-ES"/>
+        </w:rPr>
+        <w:br/>
+        <w:t>DESBORDES DE MEMORIA:</w:t>
+      </w:r>
+      <w:r>
+        <w:rPr>
+          <w:rFonts w:ascii="Times New Roman" w:hAnsi="Times New Roman" w:cs="Times New Roman"/>
+          <w:sz w:val="24"/>
+          <w:szCs w:val="24"/>
+          <w:lang w:val="es-ES"/>
+        </w:rPr>
+        <w:br/>
+        <w:t xml:space="preserve">Se detectaron errores al intentar acceder a memoria no reservada, especialmente en la inicialización de arreglos dinámicos de los jugadores </w:t>
+      </w:r>
+      <w:r>
+        <w:rPr>
+          <w:rFonts w:ascii="Times New Roman" w:hAnsi="Times New Roman" w:cs="Times New Roman"/>
+          <w:sz w:val="24"/>
+          <w:szCs w:val="24"/>
+          <w:lang w:val="es-ES"/>
+        </w:rPr>
+        <w:br/>
+      </w:r>
+      <w:r>
+        <w:rPr>
+          <w:rFonts w:ascii="Times New Roman" w:hAnsi="Times New Roman" w:cs="Times New Roman"/>
+          <w:sz w:val="24"/>
+          <w:szCs w:val="24"/>
+          <w:lang w:val="es-ES"/>
+        </w:rPr>
+        <w:br/>
+        <w:t>MANEJO DE LOS PUNTEROS:</w:t>
+      </w:r>
+      <w:r>
+        <w:rPr>
+          <w:rFonts w:ascii="Times New Roman" w:hAnsi="Times New Roman" w:cs="Times New Roman"/>
+          <w:sz w:val="24"/>
+          <w:szCs w:val="24"/>
+          <w:lang w:val="es-ES"/>
+        </w:rPr>
+        <w:br/>
+        <w:t xml:space="preserve">Fue necesario tener cuidado con el uso de los punteros para evitar accesos inválidos o perdidas de memoria </w:t>
+      </w:r>
+      <w:r>
+        <w:rPr>
+          <w:rFonts w:ascii="Times New Roman" w:hAnsi="Times New Roman" w:cs="Times New Roman"/>
+          <w:sz w:val="24"/>
+          <w:szCs w:val="24"/>
+          <w:lang w:val="es-ES"/>
+        </w:rPr>
+        <w:br/>
+      </w:r>
+      <w:r>
+        <w:rPr>
+          <w:rFonts w:ascii="Times New Roman" w:hAnsi="Times New Roman" w:cs="Times New Roman"/>
+          <w:sz w:val="24"/>
+          <w:szCs w:val="24"/>
+          <w:lang w:val="es-ES"/>
+        </w:rPr>
+        <w:br/>
+        <w:t>DISEÑO INICIAL INCOMPLETO:</w:t>
+      </w:r>
+      <w:r>
+        <w:rPr>
+          <w:rFonts w:ascii="Times New Roman" w:hAnsi="Times New Roman" w:cs="Times New Roman"/>
+          <w:sz w:val="24"/>
+          <w:szCs w:val="24"/>
+          <w:lang w:val="es-ES"/>
+        </w:rPr>
+        <w:br/>
+        <w:t>En etapas tempranas, algunas clases no tenían claramente definidas sus responsabilidades, lo que llevo a refactorizaciones posteriores</w:t>
+      </w:r>
+    </w:p>
+    <w:p>
+      <w:pPr>
+        <w:rPr>
+          <w:rFonts w:ascii="Times New Roman" w:hAnsi="Times New Roman" w:cs="Times New Roman"/>
+          <w:sz w:val="24"/>
+          <w:szCs w:val="24"/>
+          <w:lang w:val="es-ES"/>
+        </w:rPr>
+      </w:pPr>
+    </w:p>
+    <w:p>
+      <w:pPr>
+        <w:rPr>
+          <w:rFonts w:ascii="Times New Roman" w:hAnsi="Times New Roman" w:cs="Times New Roman"/>
+          <w:sz w:val="24"/>
+          <w:szCs w:val="24"/>
+          <w:lang w:val="es-ES"/>
+        </w:rPr>
+      </w:pPr>
+      <w:r>
+        <w:rPr>
+          <w:rFonts w:ascii="Times New Roman" w:hAnsi="Times New Roman" w:cs="Times New Roman"/>
+          <w:sz w:val="24"/>
+          <w:szCs w:val="24"/>
+          <w:lang w:val="es-ES"/>
+        </w:rPr>
+        <w:t>E EVOLUCION DE LA SOLUCION Y CONSIDERACIONES A TENER EN CUENTA EN LA IMPLEMENTACION:</w:t>
+      </w:r>
+      <w:r>
+        <w:rPr>
+          <w:rFonts w:ascii="Times New Roman" w:hAnsi="Times New Roman" w:cs="Times New Roman"/>
+          <w:sz w:val="24"/>
+          <w:szCs w:val="24"/>
+          <w:lang w:val="es-ES"/>
+        </w:rPr>
+        <w:br/>
+      </w:r>
+      <w:r>
+        <w:rPr>
+          <w:rFonts w:ascii="Times New Roman" w:hAnsi="Times New Roman" w:cs="Times New Roman"/>
+          <w:sz w:val="24"/>
+          <w:szCs w:val="24"/>
+          <w:lang w:val="es-ES"/>
+        </w:rPr>
+        <w:br/>
+      </w:r>
+      <w:r>
+        <w:rPr>
+          <w:rFonts w:ascii="Times New Roman" w:hAnsi="Times New Roman" w:cs="Times New Roman"/>
+          <w:sz w:val="24"/>
+          <w:szCs w:val="24"/>
+          <w:lang w:val="es-ES"/>
+        </w:rPr>
+        <w:br/>
+      </w:r>
+      <w:r>
+        <w:rPr>
+          <w:rFonts w:ascii="Times New Roman" w:hAnsi="Times New Roman" w:cs="Times New Roman"/>
+          <w:sz w:val="24"/>
+          <w:szCs w:val="24"/>
+          <w:lang w:val="es-ES"/>
+        </w:rPr>
+        <w:br/>
+      </w:r>
+    </w:p>
+    <w:p>
+      <w:pPr>
+        <w:rPr>
+          <w:rFonts w:ascii="Times New Roman" w:hAnsi="Times New Roman" w:cs="Times New Roman"/>
+          <w:sz w:val="24"/>
+          <w:szCs w:val="24"/>
+          <w:lang w:val="es-ES"/>
+        </w:rPr>
+      </w:pPr>
+    </w:p>
+    <w:p>
+      <w:pPr>
+        <w:rPr>
+          <w:rFonts w:ascii="Times New Roman" w:hAnsi="Times New Roman" w:cs="Times New Roman"/>
+          <w:sz w:val="24"/>
+          <w:szCs w:val="24"/>
+          <w:lang w:val="es-ES"/>
+        </w:rPr>
+      </w:pPr>
     </w:p>
     <w:sectPr>
       <w:pgSz w:w="12240" w:h="15840"/>

</xml_diff>